<commit_message>
docs: final executive report - plain language, clarified actions and phase 2 costs
Co-Authored-By: Claude Sonnet 4.6 <noreply@anthropic.com>
</commit_message>
<xml_diff>
--- a/docs/informe-v1-gerencia.docx
+++ b/docs/informe-v1-gerencia.docx
@@ -339,7 +339,7 @@
           <w:sz w:val="22"/>
           <w:szCs w:val="22"/>
         </w:rPr>
-        <w:t xml:space="preserve">Se ha completado al 100% el desarrollo del nuevo sitio web de Unidos por GPS: una plataforma digital de alto rendimiento construida con el unico objetivo de convertir visitantes en clientes potenciales de forma automatica, las 24 horas del dia, todos los dias del ano.</w:t>
+        <w:t xml:space="preserve">Se ha completado al 100% el desarrollo del nuevo sitio web de Unidos por GPS: una plataforma digital disenada especificamente para convertir visitantes en clientes potenciales de forma automatica, las 24 horas del dia, todos los dias del ano.</w:t>
       </w:r>
     </w:p>
     <w:p>
@@ -377,7 +377,7 @@
           <w:sz w:val="22"/>
           <w:szCs w:val="22"/>
         </w:rPr>
-        <w:t xml:space="preserve">El nuevo sitio reemplaza la presencia anterior en Odoo — un sistema de gestion empresarial que no fue disenado para capturar clientes — por una plataforma especializada en marketing digital y generacion de leads. Cada elemento del sitio, desde el boton de WhatsApp hasta el formulario de cotizacion, fue construido con un proposito comercial claro.</w:t>
+        <w:t xml:space="preserve">El nuevo sitio reemplaza la presencia anterior en Odoo — un sistema de gestion interna que no fue creado para capturar clientes — por una plataforma especializada en marketing digital y generacion de oportunidades comerciales. Cada elemento del sitio fue construido con un proposito de negocio claro.</w:t>
       </w:r>
     </w:p>
     <w:p>
@@ -415,7 +415,7 @@
           <w:sz w:val="22"/>
           <w:szCs w:val="22"/>
         </w:rPr>
-        <w:t xml:space="preserve">El sitio esta validado tecnicamente, probado en multiples dispositivos y listo para salir a produccion. Las acciones pendientes para el lanzamiento son de configuracion, no de desarrollo, y se detallan en la seccion 3 de este documento.</w:t>
+        <w:t xml:space="preserve">El sitio esta validado, probado en multiples dispositivos y listo para salir a produccion. Las acciones pendientes para el lanzamiento son de activacion y entrega de contenido, no de desarrollo, y se detallan con claridad en la seccion 3 de este documento.</w:t>
       </w:r>
     </w:p>
     <w:p>
@@ -681,7 +681,7 @@
                 <w:sz w:val="20"/>
                 <w:szCs w:val="20"/>
               </w:rPr>
-              <w:t xml:space="preserve">Presentacion de la empresa y sus servicios. Dirige al visitante a cotizar o escribir por WhatsApp.</w:t>
+              <w:t xml:space="preserve">Recibe al visitante, presenta la empresa y sus servicios, y lo dirige a cotizar o escribir por WhatsApp.</w:t>
             </w:r>
           </w:p>
         </w:tc>
@@ -993,7 +993,7 @@
                 <w:sz w:val="20"/>
                 <w:szCs w:val="20"/>
               </w:rPr>
-              <w:t xml:space="preserve">Presenta la camara inteligente como tecnologia de vanguardia accesible.</w:t>
+              <w:t xml:space="preserve">Presenta la camara inteligente como tecnologia de vanguardia accesible para cualquier cliente.</w:t>
             </w:r>
           </w:p>
         </w:tc>
@@ -1071,7 +1071,7 @@
                 <w:sz w:val="20"/>
                 <w:szCs w:val="20"/>
               </w:rPr>
-              <w:t xml:space="preserve">Genera confianza: historia de 13 anos, certificaciones oficiales (MTC, OSIPTEL, SUTRAN, OSINERGMIN), equipo.</w:t>
+              <w:t xml:space="preserve">Genera confianza institucional: 13 anos de historia, certificaciones MTC, OSIPTEL, SUTRAN, OSINERGMIN y foto del equipo.</w:t>
             </w:r>
           </w:p>
         </w:tc>
@@ -1149,7 +1149,7 @@
                 <w:sz w:val="20"/>
                 <w:szCs w:val="20"/>
               </w:rPr>
-              <w:t xml:space="preserve">Formulario que captura nombre, telefono y necesidad del cliente. Datos llegan al equipo comercial de inmediato.</w:t>
+              <w:t xml:space="preserve">Formulario que captura nombre, telefono y necesidad del cliente. El equipo comercial recibe la alerta en segundos.</w:t>
             </w:r>
           </w:p>
         </w:tc>
@@ -1227,7 +1227,7 @@
                 <w:sz w:val="20"/>
                 <w:szCs w:val="20"/>
               </w:rPr>
-              <w:t xml:space="preserve">Cumplimiento legal. Genera confianza en el visitante y protege a la empresa.</w:t>
+              <w:t xml:space="preserve">Cumplimiento legal segun Ley N° 29733. Genera confianza en el visitante y protege a la empresa.</w:t>
             </w:r>
           </w:p>
         </w:tc>
@@ -1309,7 +1309,7 @@
           <w:sz w:val="22"/>
           <w:szCs w:val="22"/>
         </w:rPr>
-        <w:t xml:space="preserve">Formulario de cotizacion automatico: el cliente llena sus datos, estos se almacenan en una base de datos segura y en segundos llega una alerta por email a comercial@unidosporgps.pe. Sin perder un solo lead.</w:t>
+        <w:t xml:space="preserve">Formulario de cotizacion automatico: el cliente llena sus datos, estos se guardan en una base de datos segura y el equipo comercial recibe un aviso por correo en segundos. Sin perder un solo lead.</w:t>
       </w:r>
     </w:p>
     <w:p>
@@ -1332,7 +1332,7 @@
           <w:sz w:val="22"/>
           <w:szCs w:val="22"/>
         </w:rPr>
-        <w:t xml:space="preserve">Boton de WhatsApp visible en todo momento: presente en cada pagina, con mensaje pre-escrito, conecta al visitante directamente con el equipo de ventas.</w:t>
+        <w:t xml:space="preserve">Boton de WhatsApp visible en todo momento: presente en cada pagina, con mensaje pre-escrito, conecta al visitante directamente con ventas.</w:t>
       </w:r>
     </w:p>
     <w:p>
@@ -1355,7 +1355,7 @@
           <w:sz w:val="22"/>
           <w:szCs w:val="22"/>
         </w:rPr>
-        <w:t xml:space="preserve">Numero de emergencia clicable: desde cualquier celular, un toque llama directamente. Sin copiar ni marcar manualmente.</w:t>
+        <w:t xml:space="preserve">Numero de emergencia clicable: desde cualquier celular, un solo toque llama directamente. Sin copiar ni marcar manualmente.</w:t>
       </w:r>
     </w:p>
     <w:p>
@@ -1378,7 +1378,7 @@
           <w:sz w:val="22"/>
           <w:szCs w:val="22"/>
         </w:rPr>
-        <w:t xml:space="preserve">Proteccion automatica contra spam: el sistema identifica y descarta envios falsos sin que el equipo tenga que hacer nada.</w:t>
+        <w:t xml:space="preserve">Proteccion automatica contra mensajes falsos: el sistema identifica y descarta envios de bots sin que el equipo tenga que hacer nada.</w:t>
       </w:r>
     </w:p>
     <w:p>
@@ -1476,7 +1476,7 @@
           <w:sz w:val="22"/>
           <w:szCs w:val="22"/>
         </w:rPr>
-        <w:t xml:space="preserve">El sitio fue construido siguiendo los mas altos estandares de visibilidad en buscadores. En terminos simples: cuando alguien en Lima o en cualquier ciudad del Peru busca "GPS vehicular", "rastreo GPS Peru" o terminos similares, el sitio de Unidos por GPS tendra mas posibilidades de aparecer en los primeros resultados.</w:t>
+        <w:t xml:space="preserve">El sitio fue construido siguiendo los mas altos estandares de visibilidad en buscadores. En terminos simples: cuando alguien en Lima o en cualquier ciudad del Peru busca "GPS vehicular", "rastreo GPS Peru" o terminos similares, el sitio de Unidos por GPS tendra mas posibilidades de aparecer en los primeros resultados de Google.</w:t>
       </w:r>
     </w:p>
     <w:p>
@@ -1587,7 +1587,7 @@
                 <w:sz w:val="20"/>
                 <w:szCs w:val="20"/>
               </w:rPr>
-              <w:t xml:space="preserve">EN TERMINOS DEL NEGOCIO</w:t>
+              <w:t xml:space="preserve">QUE SIGNIFICA PARA UNIDOS POR GPS</w:t>
             </w:r>
           </w:p>
         </w:tc>
@@ -1665,7 +1665,7 @@
                 <w:sz w:val="20"/>
                 <w:szCs w:val="20"/>
               </w:rPr>
-              <w:t xml:space="preserve">Un visitante que espera mas de 3 segundos abandona el sitio. Unidos por GPS no pierde clientes por lentitud — supera al 99% de los sitios web del mundo en velocidad.</w:t>
+              <w:t xml:space="preserve">Un visitante que espera mas de 3 segundos abandona el sitio. Unidos por GPS no pierde clientes por lentitud — supera al 99% de los sitios web del mundo en velocidad de carga.</w:t>
             </w:r>
           </w:p>
         </w:tc>
@@ -1705,7 +1705,7 @@
                 <w:sz w:val="20"/>
                 <w:szCs w:val="20"/>
               </w:rPr>
-              <w:t xml:space="preserve">Google lo encuentra facilmente</w:t>
+              <w:t xml:space="preserve">Google lo encuentra y lo recomienda facilmente</w:t>
             </w:r>
           </w:p>
         </w:tc>
@@ -1743,7 +1743,7 @@
                 <w:sz w:val="20"/>
                 <w:szCs w:val="20"/>
               </w:rPr>
-              <w:t xml:space="preserve">El sitio esta configurado al maximo nivel tecnico para que Google lo indexe y lo recomiende. Esto se traduce en mas visitas organicas sin pagar publicidad.</w:t>
+              <w:t xml:space="preserve">El sitio fue configurado al maximo nivel para que Google lo indexe y lo muestre en busquedas relevantes. Mas visitas organicas sin necesidad de pagar publicidad adicional.</w:t>
             </w:r>
           </w:p>
         </w:tc>
@@ -1861,7 +1861,7 @@
                 <w:sz w:val="20"/>
                 <w:szCs w:val="20"/>
               </w:rPr>
-              <w:t xml:space="preserve">Cualquier persona puede navegarlo</w:t>
+              <w:t xml:space="preserve">Cualquier persona puede navegarlo sin dificultad</w:t>
             </w:r>
           </w:p>
         </w:tc>
@@ -1899,7 +1899,7 @@
                 <w:sz w:val="20"/>
                 <w:szCs w:val="20"/>
               </w:rPr>
-              <w:t xml:space="preserve">Incluye a personas mayores, personas con discapacidad visual y usuarios con conexiones lentas. Mas audiencia alcanzada, mas oportunidades de venta.</w:t>
+              <w:t xml:space="preserve">Incluye a personas mayores, usuarios con conexiones lentas y personas con alguna discapacidad visual. Mas audiencia alcanzada significa mas oportunidades de venta.</w:t>
             </w:r>
           </w:p>
         </w:tc>
@@ -1982,7 +1982,7 @@
           <w:sz w:val="30"/>
           <w:szCs w:val="30"/>
         </w:rPr>
-        <w:t xml:space="preserve">3. Estado Actual — Que falta para el lanzamiento</w:t>
+        <w:t xml:space="preserve">3. Estado Actual — Que necesitamos para lanzar</w:t>
       </w:r>
     </w:p>
     <w:p>
@@ -2020,7 +2020,7 @@
           <w:sz w:val="22"/>
           <w:szCs w:val="22"/>
         </w:rPr>
-        <w:t xml:space="preserve">El desarrollo esta 100% completo. Lo que queda para conectar el sitio al dominio oficial unidosporgps.pe son acciones de configuracion y entrega de contenido — no de desarrollo. El equipo de Unidos por GPS es responsable de los puntos marcados como "Cliente".</w:t>
+        <w:t xml:space="preserve">El desarrollo esta 100% completo. Lo que queda para publicar el sitio en unidosporgps.pe son seis acciones concretas. Tres las realiza el equipo de desarrollo y tres las realiza el equipo de Unidos por GPS. Ninguna requiere conocimientos tecnicos del lado del cliente.</w:t>
       </w:r>
     </w:p>
     <w:p>
@@ -2095,7 +2095,7 @@
                 <w:sz w:val="20"/>
                 <w:szCs w:val="20"/>
               </w:rPr>
-              <w:t xml:space="preserve">ACCION REQUERIDA</w:t>
+              <w:t xml:space="preserve">QUE HAY QUE HACER</w:t>
             </w:r>
           </w:p>
         </w:tc>
@@ -2133,7 +2133,7 @@
                 <w:sz w:val="20"/>
                 <w:szCs w:val="20"/>
               </w:rPr>
-              <w:t xml:space="preserve">RESPONSABLE</w:t>
+              <w:t xml:space="preserve">QUIEN LO HACE</w:t>
             </w:r>
           </w:p>
         </w:tc>
@@ -2249,7 +2249,7 @@
                 <w:sz w:val="20"/>
                 <w:szCs w:val="20"/>
               </w:rPr>
-              <w:t xml:space="preserve">Activar plan comercial de la plataforma de alojamiento web (obligatorio para uso empresarial)</w:t>
+              <w:t xml:space="preserve">Habilitar el sitio para uso empresarial — paso previo y obligatorio para el lanzamiento</w:t>
             </w:r>
           </w:p>
         </w:tc>
@@ -2403,7 +2403,7 @@
                 <w:sz w:val="20"/>
                 <w:szCs w:val="20"/>
               </w:rPr>
-              <w:t xml:space="preserve">Apuntar el dominio unidosporgps.pe al nuevo servidor (configuracion DNS)</w:t>
+              <w:t xml:space="preserve">Conectar la direccion web unidosporgps.pe con el nuevo sitio</w:t>
             </w:r>
           </w:p>
         </w:tc>
@@ -2441,7 +2441,7 @@
                 <w:sz w:val="20"/>
                 <w:szCs w:val="20"/>
               </w:rPr>
-              <w:t xml:space="preserve">Cliente — admin del dominio</w:t>
+              <w:t xml:space="preserve">Cliente — administrador del dominio</w:t>
             </w:r>
           </w:p>
         </w:tc>
@@ -2557,7 +2557,7 @@
                 <w:sz w:val="20"/>
                 <w:szCs w:val="20"/>
               </w:rPr>
-              <w:t xml:space="preserve">Activar envio de emails desde @unidosporgps.pe</w:t>
+              <w:t xml:space="preserve">Habilitar el envio de correos con el nombre de la empresa (@unidosporgps.pe)</w:t>
             </w:r>
           </w:p>
         </w:tc>
@@ -2711,7 +2711,7 @@
                 <w:sz w:val="20"/>
                 <w:szCs w:val="20"/>
               </w:rPr>
-              <w:t xml:space="preserve">Entrega de logos oficiales: MTC, OSIPTEL, SUTRAN en alta resolucion</w:t>
+              <w:t xml:space="preserve">Entrega de logos oficiales: MTC, OSIPTEL, SUTRAN en alta resolucion con fondo transparente</w:t>
             </w:r>
           </w:p>
         </w:tc>
@@ -2865,7 +2865,7 @@
                 <w:sz w:val="20"/>
                 <w:szCs w:val="20"/>
               </w:rPr>
-              <w:t xml:space="preserve">Entrega de estadisticas reales de la empresa (vehiculos, anos, recuperaciones)</w:t>
+              <w:t xml:space="preserve">Entrega de cifras reales de la empresa: vehiculos protegidos, tasa de recuperacion, etc.</w:t>
             </w:r>
           </w:p>
         </w:tc>
@@ -3019,7 +3019,7 @@
                 <w:sz w:val="20"/>
                 <w:szCs w:val="20"/>
               </w:rPr>
-              <w:t xml:space="preserve">Entrega de 3 testimonios reales de clientes</w:t>
+              <w:t xml:space="preserve">Entrega de 3 testimonios reales de clientes satisfechos (nombre, texto y foto opcional)</w:t>
             </w:r>
           </w:p>
         </w:tc>
@@ -3190,7 +3190,7 @@
           <w:sz w:val="22"/>
           <w:szCs w:val="22"/>
         </w:rPr>
-        <w:t xml:space="preserve"> Los logos, estadisticas y testimonios (filas 4, 5 y 6) NO son requisito para lanzar. El sitio puede salir a produccion con el contenido actual y estos datos se incorporan en dias posteriores sin detener operaciones.</w:t>
+        <w:t xml:space="preserve"> Las ultimas tres acciones (logos, cifras y testimonios) no bloquean el lanzamiento. El sitio puede publicarse y estos contenidos se incorporan en los dias siguientes, sin detener operaciones.</w:t>
       </w:r>
     </w:p>
     <w:p>
@@ -3230,7 +3230,7 @@
           <w:sz w:val="30"/>
           <w:szCs w:val="30"/>
         </w:rPr>
-        <w:t xml:space="preserve">4. Fase 2 — Autonomia Total del Equipo Comercial</w:t>
+        <w:t xml:space="preserve">4. Fase 2 — El equipo actualiza el sitio sin depender de nadie</w:t>
       </w:r>
     </w:p>
     <w:p>
@@ -3267,26 +3267,7 @@
           <w:sz w:val="24"/>
           <w:szCs w:val="24"/>
         </w:rPr>
-        <w:t xml:space="preserve">El equipo actualiza el sitio sin depender de un desarrollador — desde cualquier dispositivo, en minutos</w:t>
-      </w:r>
-    </w:p>
-    <w:p>
-      <w:pPr>
-        <w:spacing w:after="120" w:before="60"/>
-        <w:jc w:val="left"/>
-      </w:pPr>
-      <w:r>
-        <w:rPr>
-          <w:rFonts w:ascii="Arial" w:cs="Arial" w:eastAsia="Arial" w:hAnsi="Arial"/>
-          <w:b w:val="false"/>
-          <w:bCs w:val="false"/>
-          <w:i w:val="false"/>
-          <w:iCs w:val="false"/>
-          <w:color w:val="374151"/>
-          <w:sz w:val="22"/>
-          <w:szCs w:val="22"/>
-        </w:rPr>
-        <w:t xml:space="preserve">Una vez el sitio este en produccion (Fase 1), la Fase 2 incorpora un Panel de Administracion de Contenidos. Esta herramienta permite al equipo comercial gestionar el sitio de forma completamente autonoma — como si fuera un editor de texto avanzado, sin ningun conocimiento tecnico.</w:t>
+        <w:t xml:space="preserve">Una vez el sitio este publicado, el equipo comercial tendra un panel propio para mantenerlo siempre al dia — sin llamar a un desarrollador, sin conocimientos tecnicos, desde cualquier dispositivo con internet.</w:t>
       </w:r>
     </w:p>
     <w:p>
@@ -3323,7 +3304,7 @@
           <w:sz w:val="24"/>
           <w:szCs w:val="24"/>
         </w:rPr>
-        <w:t xml:space="preserve">4.1 Que puede hacer el equipo por su cuenta</w:t>
+        <w:t xml:space="preserve">4.1 Que podra hacer el equipo por su cuenta</w:t>
       </w:r>
     </w:p>
     <w:p>
@@ -3434,7 +3415,7 @@
           <w:sz w:val="22"/>
           <w:szCs w:val="22"/>
         </w:rPr>
-        <w:t xml:space="preserve">Subir los logos de nuevas homologaciones o certificaciones</w:t>
+        <w:t xml:space="preserve">Publicar los logos de nuevas homologaciones o certificaciones</w:t>
       </w:r>
     </w:p>
     <w:p>
@@ -3457,7 +3438,7 @@
           <w:sz w:val="22"/>
           <w:szCs w:val="22"/>
         </w:rPr>
-        <w:t xml:space="preserve">Crear una pagina para un nuevo servicio sin necesidad de un desarrollador</w:t>
+        <w:t xml:space="preserve">Crear la pagina de un nuevo servicio sin necesidad de un desarrollador</w:t>
       </w:r>
     </w:p>
     <w:p>
@@ -3517,7 +3498,7 @@
           <w:sz w:val="24"/>
           <w:szCs w:val="24"/>
         </w:rPr>
-        <w:t xml:space="preserve">4.2 La herramienta: Sanity CMS</w:t>
+        <w:t xml:space="preserve">4.2 Como funciona el panel de administracion</w:t>
       </w:r>
     </w:p>
     <w:p>
@@ -3555,7 +3536,99 @@
           <w:sz w:val="22"/>
           <w:szCs w:val="22"/>
         </w:rPr>
-        <w:t xml:space="preserve">El panel de administracion elegido es Sanity CMS, considerado el estandar mundial para sitios web modernos de marketing. Es utilizado por empresas de tecnologia global como Figma, Cloudflare y Netlify. El acceso es desde cualquier navegador web; el equipo comercial puede actualizar el sitio desde su computadora o celular sin instalar ningun programa.</w:t>
+        <w:t xml:space="preserve">Es un tablero web — similar a un editor de documentos o a Google Drive — donde el equipo comercial puede ingresar, hacer clic en la seccion que desea modificar, cargar una imagen o escribir un texto, y guardar. El cambio aparece en el sitio web en menos de un minuto, de forma automatica.</w:t>
+      </w:r>
+    </w:p>
+    <w:p>
+      <w:pPr>
+        <w:spacing w:after="18" w:before="18"/>
+        <w:jc w:val="left"/>
+      </w:pPr>
+      <w:r>
+        <w:rPr>
+          <w:rFonts w:ascii="Arial" w:cs="Arial" w:eastAsia="Arial" w:hAnsi="Arial"/>
+          <w:b w:val="false"/>
+          <w:bCs w:val="false"/>
+          <w:i w:val="false"/>
+          <w:iCs w:val="false"/>
+          <w:color w:val="374151"/>
+          <w:sz w:val="22"/>
+          <w:szCs w:val="22"/>
+        </w:rPr>
+        <w:t xml:space="preserve"/>
+      </w:r>
+    </w:p>
+    <w:p>
+      <w:pPr>
+        <w:spacing w:after="120" w:before="60"/>
+        <w:jc w:val="left"/>
+      </w:pPr>
+      <w:r>
+        <w:rPr>
+          <w:rFonts w:ascii="Arial" w:cs="Arial" w:eastAsia="Arial" w:hAnsi="Arial"/>
+          <w:b w:val="false"/>
+          <w:bCs w:val="false"/>
+          <w:i w:val="false"/>
+          <w:iCs w:val="false"/>
+          <w:color w:val="374151"/>
+          <w:sz w:val="22"/>
+          <w:szCs w:val="22"/>
+        </w:rPr>
+        <w:t xml:space="preserve">No requiere instalar ningun programa. Se accede desde el navegador web, igual que se accede al correo electronico o a cualquier sitio de internet. El panel cuenta con guia de uso en espanol que se entrega al equipo al finalizar la Fase 2.</w:t>
+      </w:r>
+    </w:p>
+    <w:p>
+      <w:pPr>
+        <w:spacing w:after="18" w:before="18"/>
+        <w:jc w:val="left"/>
+      </w:pPr>
+      <w:r>
+        <w:rPr>
+          <w:rFonts w:ascii="Arial" w:cs="Arial" w:eastAsia="Arial" w:hAnsi="Arial"/>
+          <w:b w:val="false"/>
+          <w:bCs w:val="false"/>
+          <w:i w:val="false"/>
+          <w:iCs w:val="false"/>
+          <w:color w:val="374151"/>
+          <w:sz w:val="22"/>
+          <w:szCs w:val="22"/>
+        </w:rPr>
+        <w:t xml:space="preserve"/>
+      </w:r>
+    </w:p>
+    <w:p>
+      <w:pPr>
+        <w:pBdr>
+          <w:left w:val="single" w:color="1A2B4A" w:sz="24" w:space="10"/>
+        </w:pBdr>
+        <w:shd w:fill="EEF2F8" w:val="clear"/>
+        <w:spacing w:after="120" w:before="120"/>
+      </w:pPr>
+      <w:r>
+        <w:rPr>
+          <w:rFonts w:ascii="Arial" w:cs="Arial" w:eastAsia="Arial" w:hAnsi="Arial"/>
+          <w:b/>
+          <w:bCs/>
+          <w:i w:val="false"/>
+          <w:iCs w:val="false"/>
+          <w:color w:val="1A2B4A"/>
+          <w:sz w:val="22"/>
+          <w:szCs w:val="22"/>
+        </w:rPr>
+        <w:t xml:space="preserve">Referencia del mercado: </w:t>
+      </w:r>
+      <w:r>
+        <w:rPr>
+          <w:rFonts w:ascii="Arial" w:cs="Arial" w:eastAsia="Arial" w:hAnsi="Arial"/>
+          <w:b w:val="false"/>
+          <w:bCs w:val="false"/>
+          <w:i w:val="false"/>
+          <w:iCs w:val="false"/>
+          <w:color w:val="1A2B4A"/>
+          <w:sz w:val="22"/>
+          <w:szCs w:val="22"/>
+        </w:rPr>
+        <w:t xml:space="preserve"> Este tipo de panel es el estandar que usan empresas de tecnologia global como Figma, Cloudflare y Netlify para gestionar el contenido de sus sitios web. La herramienta elegida es considerada la mejor de su categoria a nivel mundial.</w:t>
       </w:r>
     </w:p>
     <w:p>
@@ -3592,7 +3665,7 @@
           <w:sz w:val="24"/>
           <w:szCs w:val="24"/>
         </w:rPr>
-        <w:t xml:space="preserve">4.3 Inversion</w:t>
+        <w:t xml:space="preserve">4.3 Inversion para la Fase 2</w:t>
       </w:r>
     </w:p>
     <w:p>
@@ -3703,7 +3776,7 @@
                 <w:sz w:val="20"/>
                 <w:szCs w:val="20"/>
               </w:rPr>
-              <w:t xml:space="preserve">COSTO MENSUAL</w:t>
+              <w:t xml:space="preserve">COSTO</w:t>
             </w:r>
           </w:p>
         </w:tc>
@@ -3743,7 +3816,7 @@
                 <w:sz w:val="20"/>
                 <w:szCs w:val="20"/>
               </w:rPr>
-              <w:t xml:space="preserve">Panel de administracion de contenidos (Sanity CMS) — hasta 3 usuarios editores</w:t>
+              <w:t xml:space="preserve">Panel de administracion de contenidos — plan gratuito, hasta 3 usuarios editores</w:t>
             </w:r>
           </w:p>
         </w:tc>
@@ -3821,7 +3894,7 @@
                 <w:sz w:val="20"/>
                 <w:szCs w:val="20"/>
               </w:rPr>
-              <w:t xml:space="preserve">Alojamiento web en plataforma comercial (ya incluido desde Fase 1)</w:t>
+              <w:t xml:space="preserve">Servicio de alojamiento web (plan empresarial) — ya incluido desde Fase 1</w:t>
             </w:r>
           </w:p>
         </w:tc>
@@ -3899,7 +3972,7 @@
                 <w:sz w:val="20"/>
                 <w:szCs w:val="20"/>
               </w:rPr>
-              <w:t xml:space="preserve">Desarrollo e integracion del panel (trabajo unico, no recurrente)</w:t>
+              <w:t xml:space="preserve">Instalacion e integracion del panel en el sitio existente — trabajo unico que se realiza una sola vez y no se repite. El costo exacto se presenta en un presupuesto separado una vez aprobada la Fase 2.</w:t>
             </w:r>
           </w:p>
         </w:tc>
@@ -3937,7 +4010,7 @@
                 <w:sz w:val="20"/>
                 <w:szCs w:val="20"/>
               </w:rPr>
-              <w:t xml:space="preserve">A cotizar</w:t>
+              <w:t xml:space="preserve">A presupuestar</w:t>
             </w:r>
           </w:p>
         </w:tc>
@@ -3973,7 +4046,7 @@
                 <w:bCs/>
                 <w:i w:val="false"/>
                 <w:iCs w:val="false"/>
-                <w:color w:val="374151"/>
+                <w:color w:val="FFFFFF"/>
                 <w:sz w:val="20"/>
                 <w:szCs w:val="20"/>
               </w:rPr>
@@ -4055,7 +4128,7 @@
           <w:sz w:val="24"/>
           <w:szCs w:val="24"/>
         </w:rPr>
-        <w:t xml:space="preserve">4.4 Tiempo estimado — Fase 2</w:t>
+        <w:t xml:space="preserve">4.4 Tiempo estimado para tener el panel operativo</w:t>
       </w:r>
     </w:p>
     <w:p>
@@ -4097,20 +4170,20 @@
           <w:sz w:val="22"/>
           <w:szCs w:val="22"/>
         </w:rPr>
-        <w:t xml:space="preserve">Semanas 1-2: </w:t>
-      </w:r>
-      <w:r>
-        <w:rPr>
-          <w:rFonts w:ascii="Arial" w:cs="Arial" w:eastAsia="Arial" w:hAnsi="Arial"/>
-          <w:b w:val="false"/>
-          <w:bCs w:val="false"/>
-          <w:i w:val="false"/>
-          <w:iCs w:val="false"/>
-          <w:color w:val="374151"/>
-          <w:sz w:val="22"/>
-          <w:szCs w:val="22"/>
-        </w:rPr>
-        <w:t xml:space="preserve">Configuracion del panel de administracion y conexion con el sitio en produccion.</w:t>
+        <w:t xml:space="preserve">Semanas 1-2:</w:t>
+      </w:r>
+      <w:r>
+        <w:rPr>
+          <w:rFonts w:ascii="Arial" w:cs="Arial" w:eastAsia="Arial" w:hAnsi="Arial"/>
+          <w:b w:val="false"/>
+          <w:bCs w:val="false"/>
+          <w:i w:val="false"/>
+          <w:iCs w:val="false"/>
+          <w:color w:val="374151"/>
+          <w:sz w:val="22"/>
+          <w:szCs w:val="22"/>
+        </w:rPr>
+        <w:t xml:space="preserve"> El equipo de desarrollo instala y conecta el panel al sitio ya publicado.</w:t>
       </w:r>
     </w:p>
     <w:p>
@@ -4133,20 +4206,20 @@
           <w:sz w:val="22"/>
           <w:szCs w:val="22"/>
         </w:rPr>
-        <w:t xml:space="preserve">Semana 3: </w:t>
-      </w:r>
-      <w:r>
-        <w:rPr>
-          <w:rFonts w:ascii="Arial" w:cs="Arial" w:eastAsia="Arial" w:hAnsi="Arial"/>
-          <w:b w:val="false"/>
-          <w:bCs w:val="false"/>
-          <w:i w:val="false"/>
-          <w:iCs w:val="false"/>
-          <w:color w:val="374151"/>
-          <w:sz w:val="22"/>
-          <w:szCs w:val="22"/>
-        </w:rPr>
-        <w:t xml:space="preserve">Migracion de todo el contenido actual al nuevo sistema.</w:t>
+        <w:t xml:space="preserve">Semana 3:</w:t>
+      </w:r>
+      <w:r>
+        <w:rPr>
+          <w:rFonts w:ascii="Arial" w:cs="Arial" w:eastAsia="Arial" w:hAnsi="Arial"/>
+          <w:b w:val="false"/>
+          <w:bCs w:val="false"/>
+          <w:i w:val="false"/>
+          <w:iCs w:val="false"/>
+          <w:color w:val="374151"/>
+          <w:sz w:val="22"/>
+          <w:szCs w:val="22"/>
+        </w:rPr>
+        <w:t xml:space="preserve"> Se traslada todo el contenido actual del sitio al nuevo panel de administracion.</w:t>
       </w:r>
     </w:p>
     <w:p>
@@ -4169,20 +4242,39 @@
           <w:sz w:val="22"/>
           <w:szCs w:val="22"/>
         </w:rPr>
-        <w:t xml:space="preserve">Semana 4: </w:t>
-      </w:r>
-      <w:r>
-        <w:rPr>
-          <w:rFonts w:ascii="Arial" w:cs="Arial" w:eastAsia="Arial" w:hAnsi="Arial"/>
-          <w:b w:val="false"/>
-          <w:bCs w:val="false"/>
-          <w:i w:val="false"/>
-          <w:iCs w:val="false"/>
-          <w:color w:val="374151"/>
-          <w:sz w:val="22"/>
-          <w:szCs w:val="22"/>
-        </w:rPr>
-        <w:t xml:space="preserve">Sesion de entrenamiento con el equipo comercial y entrega de guia de uso en PDF. A partir de ese momento, el equipo es completamente autonomo.</w:t>
+        <w:t xml:space="preserve">Semana 4:</w:t>
+      </w:r>
+      <w:r>
+        <w:rPr>
+          <w:rFonts w:ascii="Arial" w:cs="Arial" w:eastAsia="Arial" w:hAnsi="Arial"/>
+          <w:b w:val="false"/>
+          <w:bCs w:val="false"/>
+          <w:i w:val="false"/>
+          <w:iCs w:val="false"/>
+          <w:color w:val="374151"/>
+          <w:sz w:val="22"/>
+          <w:szCs w:val="22"/>
+        </w:rPr>
+        <w:t xml:space="preserve"> Sesion de entrenamiento con el equipo comercial y entrega de guia de uso en PDF. A partir de ese momento, el equipo es completamente autonomo.</w:t>
+      </w:r>
+    </w:p>
+    <w:p>
+      <w:pPr>
+        <w:spacing w:after="60" w:before="60"/>
+        <w:jc w:val="left"/>
+      </w:pPr>
+      <w:r>
+        <w:rPr>
+          <w:rFonts w:ascii="Arial" w:cs="Arial" w:eastAsia="Arial" w:hAnsi="Arial"/>
+          <w:b w:val="false"/>
+          <w:bCs w:val="false"/>
+          <w:i w:val="false"/>
+          <w:iCs w:val="false"/>
+          <w:color w:val="374151"/>
+          <w:sz w:val="22"/>
+          <w:szCs w:val="22"/>
+        </w:rPr>
+        <w:t xml:space="preserve"/>
       </w:r>
     </w:p>
     <w:p>
@@ -4397,7 +4489,7 @@
                 <w:sz w:val="20"/>
                 <w:szCs w:val="20"/>
               </w:rPr>
-              <w:t xml:space="preserve">Leads por formulario</w:t>
+              <w:t xml:space="preserve">Clientes potenciales por formulario</w:t>
             </w:r>
           </w:p>
         </w:tc>
@@ -4435,7 +4527,7 @@
                 <w:sz w:val="20"/>
                 <w:szCs w:val="20"/>
               </w:rPr>
-              <w:t xml:space="preserve">Cuantos clientes potenciales llegaron al sitio y pidieron informacion. Es la metrica mas importante.</w:t>
+              <w:t xml:space="preserve">Cuantas personas llegaron al sitio y pidieron informacion o cotizacion. Es la metrica mas importante para el area comercial.</w:t>
             </w:r>
           </w:p>
         </w:tc>
@@ -4475,7 +4567,7 @@
                 <w:sz w:val="20"/>
                 <w:szCs w:val="20"/>
               </w:rPr>
-              <w:t xml:space="preserve">Clics en WhatsApp</w:t>
+              <w:t xml:space="preserve">Conversaciones iniciadas por WhatsApp</w:t>
             </w:r>
           </w:p>
         </w:tc>
@@ -4513,7 +4605,7 @@
                 <w:sz w:val="20"/>
                 <w:szCs w:val="20"/>
               </w:rPr>
-              <w:t xml:space="preserve">Cuantos visitantes prefirieron el contacto directo. En Peru es el canal de mayor tasa de cierre.</w:t>
+              <w:t xml:space="preserve">Cuantos visitantes prefirieron el contacto directo. En Peru es el canal con mayor tasa de cierre de ventas.</w:t>
             </w:r>
           </w:p>
         </w:tc>
@@ -4553,7 +4645,7 @@
                 <w:sz w:val="20"/>
                 <w:szCs w:val="20"/>
               </w:rPr>
-              <w:t xml:space="preserve">Llamadas desde el sitio</w:t>
+              <w:t xml:space="preserve">Llamadas recibidas desde el sitio</w:t>
             </w:r>
           </w:p>
         </w:tc>
@@ -4591,7 +4683,7 @@
                 <w:sz w:val="20"/>
                 <w:szCs w:val="20"/>
               </w:rPr>
-              <w:t xml:space="preserve">Mide la efectividad del numero de emergencia como canal de contacto rapido.</w:t>
+              <w:t xml:space="preserve">Mide la efectividad del numero de emergencia como canal de contacto inmediato.</w:t>
             </w:r>
           </w:p>
         </w:tc>
@@ -4669,7 +4761,7 @@
                 <w:sz w:val="20"/>
                 <w:szCs w:val="20"/>
               </w:rPr>
-              <w:t xml:space="preserve">Si el sitio sube posiciones en busquedas como "GPS vehicular Lima". Refleja el retorno de la inversion en SEO.</w:t>
+              <w:t xml:space="preserve">Si el sitio sube posiciones en busquedas como "GPS vehicular Lima". Refleja el retorno de la inversion en visibilidad digital.</w:t>
             </w:r>
           </w:p>
         </w:tc>
@@ -4709,7 +4801,7 @@
                 <w:sz w:val="20"/>
                 <w:szCs w:val="20"/>
               </w:rPr>
-              <w:t xml:space="preserve">Visitas mensuales</w:t>
+              <w:t xml:space="preserve">Visitas mensuales al sitio</w:t>
             </w:r>
           </w:p>
         </w:tc>
@@ -4747,7 +4839,7 @@
                 <w:sz w:val="20"/>
                 <w:szCs w:val="20"/>
               </w:rPr>
-              <w:t xml:space="preserve">Volumen total de personas que llegan al sitio. Permite detectar tendencias de crecimiento o caidas.</w:t>
+              <w:t xml:space="preserve">Volumen total de personas que ingresan al sitio. Permite detectar tendencias de crecimiento o caidas mes a mes.</w:t>
             </w:r>
           </w:p>
         </w:tc>
@@ -4804,7 +4896,7 @@
           <w:sz w:val="22"/>
           <w:szCs w:val="22"/>
         </w:rPr>
-        <w:t xml:space="preserve"> Todos estos indicadores estan activos desde el primer dia de lanzamiento. No requieren configuracion adicional.</w:t>
+        <w:t xml:space="preserve"> Todos estos indicadores estan activos desde el primer dia de lanzamiento, sin configuracion adicional.</w:t>
       </w:r>
     </w:p>
     <w:p>
@@ -4882,7 +4974,7 @@
           <w:sz w:val="22"/>
           <w:szCs w:val="22"/>
         </w:rPr>
-        <w:t xml:space="preserve">El nuevo sitio web de Unidos por GPS no es solo una actualizacion estetica. Es una herramienta comercial: un vendedor digital disponible las 24 horas, que captura leads, filtra spam, notifica al equipo comercial en tiempo real y posiciona a la empresa en Google — todo de forma automatica.</w:t>
+        <w:t xml:space="preserve">El nuevo sitio web de Unidos por GPS no es solo una actualizacion estetica. Es una herramienta comercial: un vendedor digital disponible las 24 horas, que captura clientes potenciales, filtra mensajes falsos, notifica al equipo comercial en tiempo real y posiciona a la empresa en Google — todo de forma automatica.</w:t>
       </w:r>
     </w:p>
     <w:p>
@@ -4958,7 +5050,7 @@
           <w:sz w:val="22"/>
           <w:szCs w:val="22"/>
         </w:rPr>
-        <w:t xml:space="preserve">Unidos por GPS llevara mas de 13 anos protegiendo vehiculos en el Peru. Este sitio web esta a la altura de esa trayectoria.</w:t>
+        <w:t xml:space="preserve">Unidos por GPS lleva mas de 13 anos protegiendo vehiculos en el Peru. Este sitio web esta a la altura de esa trayectoria.</w:t>
       </w:r>
     </w:p>
     <w:p>
@@ -5024,7 +5116,6 @@
     </w:p>
     <w:p>
       <w:pPr>
-        <w:spacing w:after="0" w:before="0"/>
         <w:jc w:val="center"/>
       </w:pPr>
       <w:r>

</xml_diff>

<commit_message>
docs: fix spelling, accents and humanize tone in executive report
Co-Authored-By: Claude Sonnet 4.6 <noreply@anthropic.com>
</commit_message>
<xml_diff>
--- a/docs/informe-v1-gerencia.docx
+++ b/docs/informe-v1-gerencia.docx
@@ -31,7 +31,7 @@
           <wp:inline distT="0" distB="0" distL="0" distR="0">
             <wp:extent cx="1714500" cy="1333500"/>
             <wp:effectExtent t="0" r="0" b="0" l="0"/>
-            <wp:docPr id="1" name="logo" descr="Logo de la empresa" title="Logo Unidos por GPS"/>
+            <wp:docPr id="1" name="logo" descr="Logotipo de la empresa" title="Logo Unidos por GPS"/>
             <wp:cNvGraphicFramePr>
               <a:graphicFrameLocks xmlns:a="http://schemas.openxmlformats.org/drawingml/2006/main" noChangeAspect="1"/>
             </wp:cNvGraphicFramePr>
@@ -87,7 +87,7 @@
           <w:sz w:val="40"/>
           <w:szCs w:val="40"/>
         </w:rPr>
-        <w:t xml:space="preserve">IMPLEMENTACION DIGITAL</w:t>
+        <w:t xml:space="preserve">IMPLEMENTACIÓN DIGITAL</w:t>
       </w:r>
     </w:p>
     <w:p>
@@ -106,7 +106,7 @@
           <w:sz w:val="28"/>
           <w:szCs w:val="28"/>
         </w:rPr>
-        <w:t xml:space="preserve">INFORME DE ENTREGA — VERSION 1.0</w:t>
+        <w:t xml:space="preserve">INFORME DE ENTREGA — VERSIÓN 1.0</w:t>
       </w:r>
     </w:p>
     <w:p>
@@ -125,7 +125,7 @@
           <w:sz w:val="22"/>
           <w:szCs w:val="22"/>
         </w:rPr>
-        <w:t xml:space="preserve">Documento ejecutivo para Gerencia General y Area Comercial</w:t>
+        <w:t xml:space="preserve">Documento ejecutivo para Gerencia General y Área Comercial</w:t>
       </w:r>
     </w:p>
     <w:p>
@@ -253,7 +253,7 @@
                 <w:sz w:val="28"/>
                 <w:szCs w:val="28"/>
               </w:rPr>
-              <w:t xml:space="preserve">Desarrollo Version 1.0: COMPLETADO</w:t>
+              <w:t xml:space="preserve">Desarrollo Versión 1.0: COMPLETADO</w:t>
             </w:r>
           </w:p>
           <w:p>
@@ -272,7 +272,7 @@
                 <w:sz w:val="22"/>
                 <w:szCs w:val="22"/>
               </w:rPr>
-              <w:t xml:space="preserve">El sitio esta listo para conectarse a unidosporgps.pe</w:t>
+              <w:t xml:space="preserve">El sitio está listo para conectarse a unidosporgps.pe</w:t>
             </w:r>
           </w:p>
         </w:tc>
@@ -339,7 +339,7 @@
           <w:sz w:val="22"/>
           <w:szCs w:val="22"/>
         </w:rPr>
-        <w:t xml:space="preserve">Se ha completado al 100% el desarrollo del nuevo sitio web de Unidos por GPS: una plataforma digital disenada especificamente para convertir visitantes en clientes potenciales de forma automatica, las 24 horas del dia, todos los dias del ano.</w:t>
+        <w:t xml:space="preserve">El sitio web de Unidos por GPS está listo. No es solo una página de presentación: es el primer canal digital de la empresa diseñado exclusivamente para conseguir clientes, de forma automática, las 24 horas del día, sin que nadie tenga que estar presente para atenderlos.</w:t>
       </w:r>
     </w:p>
     <w:p>
@@ -377,7 +377,7 @@
           <w:sz w:val="22"/>
           <w:szCs w:val="22"/>
         </w:rPr>
-        <w:t xml:space="preserve">El nuevo sitio reemplaza la presencia anterior en Odoo — un sistema de gestion interna que no fue creado para capturar clientes — por una plataforma especializada en marketing digital y generacion de oportunidades comerciales. Cada elemento del sitio fue construido con un proposito de negocio claro.</w:t>
+        <w:t xml:space="preserve">Este sitio reemplaza la presencia anterior en Odoo — un sistema de gestión interna que nunca fue creado para capturar clientes — por una plataforma pensada de principio a fin para generar oportunidades comerciales. Cada sección, cada botón y cada formulario tiene un propósito de negocio claro.</w:t>
       </w:r>
     </w:p>
     <w:p>
@@ -415,7 +415,7 @@
           <w:sz w:val="22"/>
           <w:szCs w:val="22"/>
         </w:rPr>
-        <w:t xml:space="preserve">El sitio esta validado, probado en multiples dispositivos y listo para salir a produccion. Las acciones pendientes para el lanzamiento son de activacion y entrega de contenido, no de desarrollo, y se detallan con claridad en la seccion 3 de este documento.</w:t>
+        <w:t xml:space="preserve">El desarrollo está terminado al 100 %. Las acciones que faltan para publicarlo en unidosporgps.pe no son de desarrollo: son pasos de activación y entrega de contenido que se detallan con claridad en la sección 3 de este documento.</w:t>
       </w:r>
     </w:p>
     <w:p>
@@ -455,7 +455,7 @@
           <w:sz w:val="30"/>
           <w:szCs w:val="30"/>
         </w:rPr>
-        <w:t xml:space="preserve">2. Que se entrega — Version 1.0</w:t>
+        <w:t xml:space="preserve">2. ¿Qué se entrega? — Versión 1.0</w:t>
       </w:r>
     </w:p>
     <w:p>
@@ -565,7 +565,7 @@
                 <w:sz w:val="20"/>
                 <w:szCs w:val="20"/>
               </w:rPr>
-              <w:t xml:space="preserve">PAGINA</w:t>
+              <w:t xml:space="preserve">PÁGINA</w:t>
             </w:r>
           </w:p>
         </w:tc>
@@ -603,7 +603,7 @@
                 <w:sz w:val="20"/>
                 <w:szCs w:val="20"/>
               </w:rPr>
-              <w:t xml:space="preserve">QUE HACE POR EL NEGOCIO</w:t>
+              <w:t xml:space="preserve">QUÉ HACE POR EL NEGOCIO</w:t>
             </w:r>
           </w:p>
         </w:tc>
@@ -681,7 +681,7 @@
                 <w:sz w:val="20"/>
                 <w:szCs w:val="20"/>
               </w:rPr>
-              <w:t xml:space="preserve">Recibe al visitante, presenta la empresa y sus servicios, y lo dirige a cotizar o escribir por WhatsApp.</w:t>
+              <w:t xml:space="preserve">La primera impresión. Presenta la empresa, sus servicios y los diferenciadores clave, y lleva al visitante a cotizar o escribir por WhatsApp desde el primer scroll.</w:t>
             </w:r>
           </w:p>
         </w:tc>
@@ -759,7 +759,7 @@
                 <w:sz w:val="20"/>
                 <w:szCs w:val="20"/>
               </w:rPr>
-              <w:t xml:space="preserve">Convierte al dueno de vehiculo particular en lead. Detalla beneficios y genera confianza.</w:t>
+              <w:t xml:space="preserve">Convierte al dueño de vehículo particular en cliente potencial. Detalla beneficios, genera confianza y lleva a la acción.</w:t>
             </w:r>
           </w:p>
         </w:tc>
@@ -837,7 +837,7 @@
                 <w:sz w:val="20"/>
                 <w:szCs w:val="20"/>
               </w:rPr>
-              <w:t xml:space="preserve">Pagina orientada a empresas con multiples vehiculos. Habla el idioma del gestor de flota.</w:t>
+              <w:t xml:space="preserve">Página pensada para empresas con múltiples vehículos. Habla el idioma del gestor de flota: eficiencia, control y reducción de costos.</w:t>
             </w:r>
           </w:p>
         </w:tc>
@@ -915,7 +915,7 @@
                 <w:sz w:val="20"/>
                 <w:szCs w:val="20"/>
               </w:rPr>
-              <w:t xml:space="preserve">Pagina exclusiva para este servicio diferenciado con su propuesta de valor propia.</w:t>
+              <w:t xml:space="preserve">Página dedicada a este servicio diferenciado, con su propia propuesta de valor y llamada a la acción.</w:t>
             </w:r>
           </w:p>
         </w:tc>
@@ -993,7 +993,7 @@
                 <w:sz w:val="20"/>
                 <w:szCs w:val="20"/>
               </w:rPr>
-              <w:t xml:space="preserve">Presenta la camara inteligente como tecnologia de vanguardia accesible para cualquier cliente.</w:t>
+              <w:t xml:space="preserve">Posiciona la cámara inteligente como tecnología de vanguardia accesible. Ideal para captar clientes que buscan protección avanzada.</w:t>
             </w:r>
           </w:p>
         </w:tc>
@@ -1071,7 +1071,7 @@
                 <w:sz w:val="20"/>
                 <w:szCs w:val="20"/>
               </w:rPr>
-              <w:t xml:space="preserve">Genera confianza institucional: 13 anos de historia, certificaciones MTC, OSIPTEL, SUTRAN, OSINERGMIN y foto del equipo.</w:t>
+              <w:t xml:space="preserve">Genera confianza institucional: 13 años de historia, certificaciones oficiales (MTC, OSIPTEL, SUTRAN, OSINERGMIN) y el equipo detrás de la empresa.</w:t>
             </w:r>
           </w:p>
         </w:tc>
@@ -1149,7 +1149,7 @@
                 <w:sz w:val="20"/>
                 <w:szCs w:val="20"/>
               </w:rPr>
-              <w:t xml:space="preserve">Formulario que captura nombre, telefono y necesidad del cliente. El equipo comercial recibe la alerta en segundos.</w:t>
+              <w:t xml:space="preserve">El formulario que captura el nombre, teléfono y necesidad del cliente. El equipo comercial recibe la alerta en segundos, listo para llamar.</w:t>
             </w:r>
           </w:p>
         </w:tc>
@@ -1189,7 +1189,7 @@
                 <w:sz w:val="20"/>
                 <w:szCs w:val="20"/>
               </w:rPr>
-              <w:t xml:space="preserve">Politica de Privacidad</w:t>
+              <w:t xml:space="preserve">Política de Privacidad</w:t>
             </w:r>
           </w:p>
         </w:tc>
@@ -1227,7 +1227,7 @@
                 <w:sz w:val="20"/>
                 <w:szCs w:val="20"/>
               </w:rPr>
-              <w:t xml:space="preserve">Cumplimiento legal segun Ley N° 29733. Genera confianza en el visitante y protege a la empresa.</w:t>
+              <w:t xml:space="preserve">Cumplimiento legal según la Ley N° 29733 de Protección de Datos. Genera confianza en el visitante y protege a la empresa.</w:t>
             </w:r>
           </w:p>
         </w:tc>
@@ -1267,7 +1267,7 @@
           <w:sz w:val="24"/>
           <w:szCs w:val="24"/>
         </w:rPr>
-        <w:t xml:space="preserve">2.2 Herramientas de captacion de clientes</w:t>
+        <w:t xml:space="preserve">2.2 Herramientas de captación de clientes</w:t>
       </w:r>
     </w:p>
     <w:p>
@@ -1309,7 +1309,7 @@
           <w:sz w:val="22"/>
           <w:szCs w:val="22"/>
         </w:rPr>
-        <w:t xml:space="preserve">Formulario de cotizacion automatico: el cliente llena sus datos, estos se guardan en una base de datos segura y el equipo comercial recibe un aviso por correo en segundos. Sin perder un solo lead.</w:t>
+        <w:t xml:space="preserve">Formulario de cotización automático: el cliente llena sus datos, estos se guardan en una base de datos segura y el equipo comercial recibe un aviso por correo en segundos. Sin perder un solo contacto.</w:t>
       </w:r>
     </w:p>
     <w:p>
@@ -1332,7 +1332,7 @@
           <w:sz w:val="22"/>
           <w:szCs w:val="22"/>
         </w:rPr>
-        <w:t xml:space="preserve">Boton de WhatsApp visible en todo momento: presente en cada pagina, con mensaje pre-escrito, conecta al visitante directamente con ventas.</w:t>
+        <w:t xml:space="preserve">Botón de WhatsApp siempre visible: presente en cada página, con un mensaje pre-escrito, conecta al visitante directamente con el equipo de ventas en un solo toque.</w:t>
       </w:r>
     </w:p>
     <w:p>
@@ -1355,7 +1355,7 @@
           <w:sz w:val="22"/>
           <w:szCs w:val="22"/>
         </w:rPr>
-        <w:t xml:space="preserve">Numero de emergencia clicable: desde cualquier celular, un solo toque llama directamente. Sin copiar ni marcar manualmente.</w:t>
+        <w:t xml:space="preserve">Número de emergencia clicable: desde cualquier celular, una sola pulsación inicia la llamada. Sin copiar, sin marcar manualmente.</w:t>
       </w:r>
     </w:p>
     <w:p>
@@ -1378,7 +1378,7 @@
           <w:sz w:val="22"/>
           <w:szCs w:val="22"/>
         </w:rPr>
-        <w:t xml:space="preserve">Proteccion automatica contra mensajes falsos: el sistema identifica y descarta envios de bots sin que el equipo tenga que hacer nada.</w:t>
+        <w:t xml:space="preserve">Protección automática contra mensajes falsos: el sistema detecta y descarta envíos de bots sin que el equipo tenga que hacer nada.</w:t>
       </w:r>
     </w:p>
     <w:p>
@@ -1401,7 +1401,7 @@
           <w:sz w:val="22"/>
           <w:szCs w:val="22"/>
         </w:rPr>
-        <w:t xml:space="preserve">Panel de resultados integrado: cada lead, cada clic en WhatsApp y cada llamada queda registrado. El equipo puede ver cuantos clientes potenciales genera el sitio cada semana.</w:t>
+        <w:t xml:space="preserve">Panel de resultados integrado: cada lead, cada clic en WhatsApp y cada llamada queda registrado. El equipo puede consultar cuántos clientes potenciales genera el sitio cada semana.</w:t>
       </w:r>
     </w:p>
     <w:p>
@@ -1438,7 +1438,7 @@
           <w:sz w:val="24"/>
           <w:szCs w:val="24"/>
         </w:rPr>
-        <w:t xml:space="preserve">2.3 Presencia en Google — Lo que esto significa para el negocio</w:t>
+        <w:t xml:space="preserve">2.3 Presencia en Google — ¿Qué significa esto para el negocio?</w:t>
       </w:r>
     </w:p>
     <w:p>
@@ -1476,7 +1476,7 @@
           <w:sz w:val="22"/>
           <w:szCs w:val="22"/>
         </w:rPr>
-        <w:t xml:space="preserve">El sitio fue construido siguiendo los mas altos estandares de visibilidad en buscadores. En terminos simples: cuando alguien en Lima o en cualquier ciudad del Peru busca "GPS vehicular", "rastreo GPS Peru" o terminos similares, el sitio de Unidos por GPS tendra mas posibilidades de aparecer en los primeros resultados de Google.</w:t>
+        <w:t xml:space="preserve">El sitio fue construido siguiendo los más altos estándares de visibilidad en buscadores. En términos concretos: cuando alguien en Lima o en cualquier ciudad del Perú busca "GPS vehicular", "rastreo GPS Perú" o términos similares, el sitio de Unidos por GPS tendrá más posibilidades de aparecer entre los primeros resultados, antes que la competencia.</w:t>
       </w:r>
     </w:p>
     <w:p>
@@ -1587,7 +1587,7 @@
                 <w:sz w:val="20"/>
                 <w:szCs w:val="20"/>
               </w:rPr>
-              <w:t xml:space="preserve">QUE SIGNIFICA PARA UNIDOS POR GPS</w:t>
+              <w:t xml:space="preserve">QUÉ SIGNIFICA PARA UNIDOS POR GPS</w:t>
             </w:r>
           </w:p>
         </w:tc>
@@ -1627,7 +1627,7 @@
                 <w:sz w:val="20"/>
                 <w:szCs w:val="20"/>
               </w:rPr>
-              <w:t xml:space="preserve">El sitio carga en menos de 2 segundos</w:t>
+              <w:t xml:space="preserve">Carga en menos de 2 segundos</w:t>
             </w:r>
           </w:p>
         </w:tc>
@@ -1665,7 +1665,7 @@
                 <w:sz w:val="20"/>
                 <w:szCs w:val="20"/>
               </w:rPr>
-              <w:t xml:space="preserve">Un visitante que espera mas de 3 segundos abandona el sitio. Unidos por GPS no pierde clientes por lentitud — supera al 99% de los sitios web del mundo en velocidad de carga.</w:t>
+              <w:t xml:space="preserve">Un visitante que espera más de 3 segundos abandona el sitio. Unidos por GPS no pierde clientes por lentitud: supera al 99 % de los sitios web del mundo en velocidad.</w:t>
             </w:r>
           </w:p>
         </w:tc>
@@ -1705,7 +1705,7 @@
                 <w:sz w:val="20"/>
                 <w:szCs w:val="20"/>
               </w:rPr>
-              <w:t xml:space="preserve">Google lo encuentra y lo recomienda facilmente</w:t>
+              <w:t xml:space="preserve">Google lo encuentra y lo recomienda</w:t>
             </w:r>
           </w:p>
         </w:tc>
@@ -1743,7 +1743,7 @@
                 <w:sz w:val="20"/>
                 <w:szCs w:val="20"/>
               </w:rPr>
-              <w:t xml:space="preserve">El sitio fue configurado al maximo nivel para que Google lo indexe y lo muestre en busquedas relevantes. Mas visitas organicas sin necesidad de pagar publicidad adicional.</w:t>
+              <w:t xml:space="preserve">El sitio fue configurado al máximo nivel para que Google lo indexe y lo muestre en búsquedas relevantes. El resultado: más visitas orgánicas sin necesidad de pagar publicidad adicional.</w:t>
             </w:r>
           </w:p>
         </w:tc>
@@ -1821,7 +1821,7 @@
                 <w:sz w:val="20"/>
                 <w:szCs w:val="20"/>
               </w:rPr>
-              <w:t xml:space="preserve">El 70% del trafico web en Peru llega desde celulares. El sitio fue disenado primero para celular y se adapta perfectamente a tablets y computadoras.</w:t>
+              <w:t xml:space="preserve">El 70 % del tráfico web en el Perú llega desde celulares. El sitio fue diseñado primero para móvil y se adapta sin fricciones a tablets y computadoras.</w:t>
             </w:r>
           </w:p>
         </w:tc>
@@ -1861,7 +1861,7 @@
                 <w:sz w:val="20"/>
                 <w:szCs w:val="20"/>
               </w:rPr>
-              <w:t xml:space="preserve">Cualquier persona puede navegarlo sin dificultad</w:t>
+              <w:t xml:space="preserve">Accesible para todo tipo de usuario</w:t>
             </w:r>
           </w:p>
         </w:tc>
@@ -1899,7 +1899,7 @@
                 <w:sz w:val="20"/>
                 <w:szCs w:val="20"/>
               </w:rPr>
-              <w:t xml:space="preserve">Incluye a personas mayores, usuarios con conexiones lentas y personas con alguna discapacidad visual. Mas audiencia alcanzada significa mas oportunidades de venta.</w:t>
+              <w:t xml:space="preserve">Personas mayores, usuarios con conexiones lentas o con alguna dificultad visual pueden navegarlo sin problema. Más audiencia alcanzada significa más oportunidades de venta.</w:t>
             </w:r>
           </w:p>
         </w:tc>
@@ -1943,7 +1943,7 @@
           <w:sz w:val="22"/>
           <w:szCs w:val="22"/>
         </w:rPr>
-        <w:t xml:space="preserve">Referencia: </w:t>
+        <w:t xml:space="preserve">Para ponerlo en perspectiva: </w:t>
       </w:r>
       <w:r>
         <w:rPr>
@@ -1956,7 +1956,7 @@
           <w:sz w:val="22"/>
           <w:szCs w:val="22"/>
         </w:rPr>
-        <w:t xml:space="preserve"> El promedio de sitios web del mercado obtiene entre 50 y 70 puntos en las mediciones de Google. El sitio de Unidos por GPS obtiene 99 — el nivel de empresas tecnologicas globales de primer nivel.</w:t>
+        <w:t xml:space="preserve"> El promedio de sitios web en el mercado obtiene entre 50 y 70 puntos en las mediciones de Google. El sitio de Unidos por GPS obtiene 99, el nivel que alcanzan las empresas tecnológicas globales de primer nivel.</w:t>
       </w:r>
     </w:p>
     <w:p>
@@ -1982,7 +1982,7 @@
           <w:sz w:val="30"/>
           <w:szCs w:val="30"/>
         </w:rPr>
-        <w:t xml:space="preserve">3. Estado Actual — Que necesitamos para lanzar</w:t>
+        <w:t xml:space="preserve">3. ¿Qué necesitamos para lanzar?</w:t>
       </w:r>
     </w:p>
     <w:p>
@@ -2020,7 +2020,7 @@
           <w:sz w:val="22"/>
           <w:szCs w:val="22"/>
         </w:rPr>
-        <w:t xml:space="preserve">El desarrollo esta 100% completo. Lo que queda para publicar el sitio en unidosporgps.pe son seis acciones concretas. Tres las realiza el equipo de desarrollo y tres las realiza el equipo de Unidos por GPS. Ninguna requiere conocimientos tecnicos del lado del cliente.</w:t>
+        <w:t xml:space="preserve">El desarrollo está terminado. Lo que falta para publicar el sitio en unidosporgps.pe son seis acciones concretas: tres las ejecuta el equipo de desarrollo y tres las realiza el propio equipo de Unidos por GPS. Ninguna requiere conocimientos técnicos por parte del cliente.</w:t>
       </w:r>
     </w:p>
     <w:p>
@@ -2095,7 +2095,7 @@
                 <w:sz w:val="20"/>
                 <w:szCs w:val="20"/>
               </w:rPr>
-              <w:t xml:space="preserve">QUE HAY QUE HACER</w:t>
+              <w:t xml:space="preserve">QUÉ HAY QUE HACER</w:t>
             </w:r>
           </w:p>
         </w:tc>
@@ -2133,7 +2133,7 @@
                 <w:sz w:val="20"/>
                 <w:szCs w:val="20"/>
               </w:rPr>
-              <w:t xml:space="preserve">QUIEN LO HACE</w:t>
+              <w:t xml:space="preserve">QUIÉN LO HACE</w:t>
             </w:r>
           </w:p>
         </w:tc>
@@ -2249,7 +2249,7 @@
                 <w:sz w:val="20"/>
                 <w:szCs w:val="20"/>
               </w:rPr>
-              <w:t xml:space="preserve">Habilitar el sitio para uso empresarial — paso previo y obligatorio para el lanzamiento</w:t>
+              <w:t xml:space="preserve">Habilitar el sitio para uso empresarial — requisito previo y obligatorio antes del lanzamiento.</w:t>
             </w:r>
           </w:p>
         </w:tc>
@@ -2325,7 +2325,7 @@
                 <w:sz w:val="20"/>
                 <w:szCs w:val="20"/>
               </w:rPr>
-              <w:t xml:space="preserve">1 dia</w:t>
+              <w:t xml:space="preserve">1 día</w:t>
             </w:r>
           </w:p>
         </w:tc>
@@ -2403,7 +2403,7 @@
                 <w:sz w:val="20"/>
                 <w:szCs w:val="20"/>
               </w:rPr>
-              <w:t xml:space="preserve">Conectar la direccion web unidosporgps.pe con el nuevo sitio</w:t>
+              <w:t xml:space="preserve">Conectar la dirección web unidosporgps.pe con el nuevo sitio.</w:t>
             </w:r>
           </w:p>
         </w:tc>
@@ -2479,7 +2479,7 @@
                 <w:sz w:val="20"/>
                 <w:szCs w:val="20"/>
               </w:rPr>
-              <w:t xml:space="preserve">1-2 dias habiles</w:t>
+              <w:t xml:space="preserve">1–2 días hábiles</w:t>
             </w:r>
           </w:p>
         </w:tc>
@@ -2557,7 +2557,7 @@
                 <w:sz w:val="20"/>
                 <w:szCs w:val="20"/>
               </w:rPr>
-              <w:t xml:space="preserve">Habilitar el envio de correos con el nombre de la empresa (@unidosporgps.pe)</w:t>
+              <w:t xml:space="preserve">Habilitar el envío de correos con el nombre de la empresa (@unidosporgps.pe).</w:t>
             </w:r>
           </w:p>
         </w:tc>
@@ -2711,7 +2711,7 @@
                 <w:sz w:val="20"/>
                 <w:szCs w:val="20"/>
               </w:rPr>
-              <w:t xml:space="preserve">Entrega de logos oficiales: MTC, OSIPTEL, SUTRAN en alta resolucion con fondo transparente</w:t>
+              <w:t xml:space="preserve">Entrega de logos oficiales (MTC, OSIPTEL, SUTRAN) en alta resolución con fondo transparente.</w:t>
             </w:r>
           </w:p>
         </w:tc>
@@ -2749,7 +2749,7 @@
                 <w:sz w:val="20"/>
                 <w:szCs w:val="20"/>
               </w:rPr>
-              <w:t xml:space="preserve">Cliente — area de marketing</w:t>
+              <w:t xml:space="preserve">Cliente — área de marketing</w:t>
             </w:r>
           </w:p>
         </w:tc>
@@ -2787,7 +2787,7 @@
                 <w:sz w:val="20"/>
                 <w:szCs w:val="20"/>
               </w:rPr>
-              <w:t xml:space="preserve">Segun disponibilidad</w:t>
+              <w:t xml:space="preserve">Según disponibilidad</w:t>
             </w:r>
           </w:p>
         </w:tc>
@@ -2865,7 +2865,7 @@
                 <w:sz w:val="20"/>
                 <w:szCs w:val="20"/>
               </w:rPr>
-              <w:t xml:space="preserve">Entrega de cifras reales de la empresa: vehiculos protegidos, tasa de recuperacion, etc.</w:t>
+              <w:t xml:space="preserve">Entrega de cifras reales de la empresa: vehículos protegidos, tasa de recuperación, años de experiencia, etc.</w:t>
             </w:r>
           </w:p>
         </w:tc>
@@ -2941,7 +2941,7 @@
                 <w:sz w:val="20"/>
                 <w:szCs w:val="20"/>
               </w:rPr>
-              <w:t xml:space="preserve">Segun disponibilidad</w:t>
+              <w:t xml:space="preserve">Según disponibilidad</w:t>
             </w:r>
           </w:p>
         </w:tc>
@@ -3019,7 +3019,7 @@
                 <w:sz w:val="20"/>
                 <w:szCs w:val="20"/>
               </w:rPr>
-              <w:t xml:space="preserve">Entrega de 3 testimonios reales de clientes satisfechos (nombre, texto y foto opcional)</w:t>
+              <w:t xml:space="preserve">Entrega de 3 testimonios reales de clientes satisfechos (nombre, texto y foto opcional).</w:t>
             </w:r>
           </w:p>
         </w:tc>
@@ -3057,7 +3057,7 @@
                 <w:sz w:val="20"/>
                 <w:szCs w:val="20"/>
               </w:rPr>
-              <w:t xml:space="preserve">Cliente — area comercial</w:t>
+              <w:t xml:space="preserve">Cliente — área comercial</w:t>
             </w:r>
           </w:p>
         </w:tc>
@@ -3095,7 +3095,7 @@
                 <w:sz w:val="20"/>
                 <w:szCs w:val="20"/>
               </w:rPr>
-              <w:t xml:space="preserve">Segun disponibilidad</w:t>
+              <w:t xml:space="preserve">Según disponibilidad</w:t>
             </w:r>
           </w:p>
         </w:tc>
@@ -3190,7 +3190,7 @@
           <w:sz w:val="22"/>
           <w:szCs w:val="22"/>
         </w:rPr>
-        <w:t xml:space="preserve"> Las ultimas tres acciones (logos, cifras y testimonios) no bloquean el lanzamiento. El sitio puede publicarse y estos contenidos se incorporan en los dias siguientes, sin detener operaciones.</w:t>
+        <w:t xml:space="preserve"> Las últimas tres acciones (logos, cifras y testimonios) no bloquean el lanzamiento. El sitio puede publicarse con el contenido actual y estos datos se incorporan en los días siguientes, sin detener operaciones.</w:t>
       </w:r>
     </w:p>
     <w:p>
@@ -3230,7 +3230,7 @@
           <w:sz w:val="30"/>
           <w:szCs w:val="30"/>
         </w:rPr>
-        <w:t xml:space="preserve">4. Fase 2 — El equipo actualiza el sitio sin depender de nadie</w:t>
+        <w:t xml:space="preserve">4. Fase 2 — El equipo gestiona el sitio sin depender de nadie</w:t>
       </w:r>
     </w:p>
     <w:p>
@@ -3267,7 +3267,7 @@
           <w:sz w:val="24"/>
           <w:szCs w:val="24"/>
         </w:rPr>
-        <w:t xml:space="preserve">Una vez el sitio este publicado, el equipo comercial tendra un panel propio para mantenerlo siempre al dia — sin llamar a un desarrollador, sin conocimientos tecnicos, desde cualquier dispositivo con internet.</w:t>
+        <w:t xml:space="preserve">Una vez el sitio esté publicado, el equipo comercial tendrá su propio panel para mantenerlo siempre actualizado — sin llamar a un desarrollador, sin conocimientos técnicos, desde cualquier dispositivo con conexión a internet.</w:t>
       </w:r>
     </w:p>
     <w:p>
@@ -3304,7 +3304,7 @@
           <w:sz w:val="24"/>
           <w:szCs w:val="24"/>
         </w:rPr>
-        <w:t xml:space="preserve">4.1 Que podra hacer el equipo por su cuenta</w:t>
+        <w:t xml:space="preserve">4.1 ¿Qué podrá hacer el equipo por su cuenta?</w:t>
       </w:r>
     </w:p>
     <w:p>
@@ -3346,7 +3346,7 @@
           <w:sz w:val="22"/>
           <w:szCs w:val="22"/>
         </w:rPr>
-        <w:t xml:space="preserve">Subir y cambiar las fotos de cualquier servicio</w:t>
+        <w:t xml:space="preserve">Subir y cambiar las fotos de cualquier servicio.</w:t>
       </w:r>
     </w:p>
     <w:p>
@@ -3369,7 +3369,7 @@
           <w:sz w:val="22"/>
           <w:szCs w:val="22"/>
         </w:rPr>
-        <w:t xml:space="preserve">Agregar, editar o eliminar testimonios de clientes</w:t>
+        <w:t xml:space="preserve">Agregar, editar o eliminar testimonios de clientes.</w:t>
       </w:r>
     </w:p>
     <w:p>
@@ -3392,7 +3392,7 @@
           <w:sz w:val="22"/>
           <w:szCs w:val="22"/>
         </w:rPr>
-        <w:t xml:space="preserve">Actualizar las cifras de la empresa: vehiculos protegidos, anos de experiencia, porcentajes</w:t>
+        <w:t xml:space="preserve">Actualizar las cifras de la empresa: vehículos protegidos, años de experiencia, porcentajes de recuperación.</w:t>
       </w:r>
     </w:p>
     <w:p>
@@ -3415,7 +3415,7 @@
           <w:sz w:val="22"/>
           <w:szCs w:val="22"/>
         </w:rPr>
-        <w:t xml:space="preserve">Publicar los logos de nuevas homologaciones o certificaciones</w:t>
+        <w:t xml:space="preserve">Publicar los logos de nuevas homologaciones o certificaciones.</w:t>
       </w:r>
     </w:p>
     <w:p>
@@ -3438,7 +3438,7 @@
           <w:sz w:val="22"/>
           <w:szCs w:val="22"/>
         </w:rPr>
-        <w:t xml:space="preserve">Crear la pagina de un nuevo servicio sin necesidad de un desarrollador</w:t>
+        <w:t xml:space="preserve">Crear la página de un nuevo servicio sin necesidad de un desarrollador.</w:t>
       </w:r>
     </w:p>
     <w:p>
@@ -3461,7 +3461,7 @@
           <w:sz w:val="22"/>
           <w:szCs w:val="22"/>
         </w:rPr>
-        <w:t xml:space="preserve">Actualizar la foto del equipo y los textos de la pagina Nosotros</w:t>
+        <w:t xml:space="preserve">Actualizar la foto del equipo y los textos de la página Nosotros.</w:t>
       </w:r>
     </w:p>
     <w:p>
@@ -3498,7 +3498,7 @@
           <w:sz w:val="24"/>
           <w:szCs w:val="24"/>
         </w:rPr>
-        <w:t xml:space="preserve">4.2 Como funciona el panel de administracion</w:t>
+        <w:t xml:space="preserve">4.2 ¿Cómo funciona el panel de administración?</w:t>
       </w:r>
     </w:p>
     <w:p>
@@ -3536,7 +3536,7 @@
           <w:sz w:val="22"/>
           <w:szCs w:val="22"/>
         </w:rPr>
-        <w:t xml:space="preserve">Es un tablero web — similar a un editor de documentos o a Google Drive — donde el equipo comercial puede ingresar, hacer clic en la seccion que desea modificar, cargar una imagen o escribir un texto, y guardar. El cambio aparece en el sitio web en menos de un minuto, de forma automatica.</w:t>
+        <w:t xml:space="preserve">Es un tablero web — similar a un editor de documentos o a Google Drive — al que el equipo accede desde su navegador, sin instalar nada. Desde ahí, hacen clic en la sección que quieren modificar, cargan una imagen o editan un texto, y guardan. El cambio aparece en el sitio en menos de un minuto, de forma automática.</w:t>
       </w:r>
     </w:p>
     <w:p>
@@ -3574,7 +3574,7 @@
           <w:sz w:val="22"/>
           <w:szCs w:val="22"/>
         </w:rPr>
-        <w:t xml:space="preserve">No requiere instalar ningun programa. Se accede desde el navegador web, igual que se accede al correo electronico o a cualquier sitio de internet. El panel cuenta con guia de uso en espanol que se entrega al equipo al finalizar la Fase 2.</w:t>
+        <w:t xml:space="preserve">Al finalizar la Fase 2, el equipo recibe una guía de uso en español con capturas de pantalla del panel real. A partir de ese momento, no hay dependencia técnica para ningún cambio de contenido.</w:t>
       </w:r>
     </w:p>
     <w:p>
@@ -3628,7 +3628,7 @@
           <w:sz w:val="22"/>
           <w:szCs w:val="22"/>
         </w:rPr>
-        <w:t xml:space="preserve"> Este tipo de panel es el estandar que usan empresas de tecnologia global como Figma, Cloudflare y Netlify para gestionar el contenido de sus sitios web. La herramienta elegida es considerada la mejor de su categoria a nivel mundial.</w:t>
+        <w:t xml:space="preserve"> Este tipo de panel es el estándar que usan hoy empresas como Figma, Cloudflare y Netlify para gestionar el contenido de sus sitios. La herramienta elegida es la mejor valorada de su categoría a nivel mundial.</w:t>
       </w:r>
     </w:p>
     <w:p>
@@ -3665,7 +3665,7 @@
           <w:sz w:val="24"/>
           <w:szCs w:val="24"/>
         </w:rPr>
-        <w:t xml:space="preserve">4.3 Inversion para la Fase 2</w:t>
+        <w:t xml:space="preserve">4.3 Inversión para la Fase 2</w:t>
       </w:r>
     </w:p>
     <w:p>
@@ -3816,7 +3816,7 @@
                 <w:sz w:val="20"/>
                 <w:szCs w:val="20"/>
               </w:rPr>
-              <w:t xml:space="preserve">Panel de administracion de contenidos — plan gratuito, hasta 3 usuarios editores</w:t>
+              <w:t xml:space="preserve">Panel de administración de contenidos — plan gratuito, hasta 3 usuarios editores.</w:t>
             </w:r>
           </w:p>
         </w:tc>
@@ -3894,7 +3894,7 @@
                 <w:sz w:val="20"/>
                 <w:szCs w:val="20"/>
               </w:rPr>
-              <w:t xml:space="preserve">Servicio de alojamiento web (plan empresarial) — ya incluido desde Fase 1</w:t>
+              <w:t xml:space="preserve">Servicio de alojamiento web en plan empresarial — ya incluido desde la Fase 1.</w:t>
             </w:r>
           </w:p>
         </w:tc>
@@ -3972,7 +3972,7 @@
                 <w:sz w:val="20"/>
                 <w:szCs w:val="20"/>
               </w:rPr>
-              <w:t xml:space="preserve">Instalacion e integracion del panel en el sitio existente — trabajo unico que se realiza una sola vez y no se repite. El costo exacto se presenta en un presupuesto separado una vez aprobada la Fase 2.</w:t>
+              <w:t xml:space="preserve">Instalación e integración del panel en el sitio existente. Es un trabajo único que se realiza una sola vez: el equipo de desarrollo conecta el panel al sitio ya publicado. El costo exacto se presenta en un presupuesto separado, una vez aprobada la Fase 2.</w:t>
             </w:r>
           </w:p>
         </w:tc>
@@ -4050,7 +4050,7 @@
                 <w:sz w:val="20"/>
                 <w:szCs w:val="20"/>
               </w:rPr>
-              <w:t xml:space="preserve">INVERSION MENSUAL OPERATIVA TOTAL</w:t>
+              <w:t xml:space="preserve">INVERSIÓN MENSUAL OPERATIVA TOTAL</w:t>
             </w:r>
           </w:p>
         </w:tc>
@@ -4128,7 +4128,7 @@
           <w:sz w:val="24"/>
           <w:szCs w:val="24"/>
         </w:rPr>
-        <w:t xml:space="preserve">4.4 Tiempo estimado para tener el panel operativo</w:t>
+        <w:t xml:space="preserve">4.4 ¿Cuánto tiempo toma tener el panel operativo?</w:t>
       </w:r>
     </w:p>
     <w:p>
@@ -4170,7 +4170,7 @@
           <w:sz w:val="22"/>
           <w:szCs w:val="22"/>
         </w:rPr>
-        <w:t xml:space="preserve">Semanas 1-2:</w:t>
+        <w:t xml:space="preserve">Semanas 1–2:</w:t>
       </w:r>
       <w:r>
         <w:rPr>
@@ -4219,7 +4219,7 @@
           <w:sz w:val="22"/>
           <w:szCs w:val="22"/>
         </w:rPr>
-        <w:t xml:space="preserve"> Se traslada todo el contenido actual del sitio al nuevo panel de administracion.</w:t>
+        <w:t xml:space="preserve"> Se traslada todo el contenido actual del sitio al nuevo panel de administración.</w:t>
       </w:r>
     </w:p>
     <w:p>
@@ -4255,7 +4255,7 @@
           <w:sz w:val="22"/>
           <w:szCs w:val="22"/>
         </w:rPr>
-        <w:t xml:space="preserve"> Sesion de entrenamiento con el equipo comercial y entrega de guia de uso en PDF. A partir de ese momento, el equipo es completamente autonomo.</w:t>
+        <w:t xml:space="preserve"> Sesión de entrenamiento con el equipo comercial y entrega de la guía de uso. Desde ese momento, el equipo es completamente autónomo.</w:t>
       </w:r>
     </w:p>
     <w:p>
@@ -4300,7 +4300,7 @@
           <w:sz w:val="30"/>
           <w:szCs w:val="30"/>
         </w:rPr>
-        <w:t xml:space="preserve">5. Como mediremos el exito del sitio</w:t>
+        <w:t xml:space="preserve">5. ¿Cómo mediremos el éxito del sitio?</w:t>
       </w:r>
     </w:p>
     <w:p>
@@ -4338,7 +4338,7 @@
           <w:sz w:val="22"/>
           <w:szCs w:val="22"/>
         </w:rPr>
-        <w:t xml:space="preserve">Desde el primer dia de operacion, el sitio genera datos que permiten tomar decisiones comerciales con informacion real. Se recomienda revisar estos indicadores mensualmente en equipo:</w:t>
+        <w:t xml:space="preserve">Desde el primer día de operación, el sitio genera información que permite tomar decisiones comerciales con datos reales, no con suposiciones. Recomendamos revisar estos indicadores en equipo una vez al mes:</w:t>
       </w:r>
     </w:p>
     <w:p>
@@ -4449,7 +4449,7 @@
                 <w:sz w:val="20"/>
                 <w:szCs w:val="20"/>
               </w:rPr>
-              <w:t xml:space="preserve">QUE NOS DICE</w:t>
+              <w:t xml:space="preserve">QUÉ NOS DICE</w:t>
             </w:r>
           </w:p>
         </w:tc>
@@ -4527,7 +4527,7 @@
                 <w:sz w:val="20"/>
                 <w:szCs w:val="20"/>
               </w:rPr>
-              <w:t xml:space="preserve">Cuantas personas llegaron al sitio y pidieron informacion o cotizacion. Es la metrica mas importante para el area comercial.</w:t>
+              <w:t xml:space="preserve">Cuántas personas llegaron al sitio y pidieron información o cotización. Es la métrica más importante para el área comercial.</w:t>
             </w:r>
           </w:p>
         </w:tc>
@@ -4605,7 +4605,7 @@
                 <w:sz w:val="20"/>
                 <w:szCs w:val="20"/>
               </w:rPr>
-              <w:t xml:space="preserve">Cuantos visitantes prefirieron el contacto directo. En Peru es el canal con mayor tasa de cierre de ventas.</w:t>
+              <w:t xml:space="preserve">Cuántos visitantes prefirieron el contacto directo. En el Perú, WhatsApp tiene la mayor tasa de cierre de ventas entre todos los canales digitales.</w:t>
             </w:r>
           </w:p>
         </w:tc>
@@ -4683,7 +4683,7 @@
                 <w:sz w:val="20"/>
                 <w:szCs w:val="20"/>
               </w:rPr>
-              <w:t xml:space="preserve">Mide la efectividad del numero de emergencia como canal de contacto inmediato.</w:t>
+              <w:t xml:space="preserve">Mide la efectividad del número de emergencia como canal de contacto rápido.</w:t>
             </w:r>
           </w:p>
         </w:tc>
@@ -4723,7 +4723,7 @@
                 <w:sz w:val="20"/>
                 <w:szCs w:val="20"/>
               </w:rPr>
-              <w:t xml:space="preserve">Posicion en Google</w:t>
+              <w:t xml:space="preserve">Posición en Google</w:t>
             </w:r>
           </w:p>
         </w:tc>
@@ -4761,7 +4761,7 @@
                 <w:sz w:val="20"/>
                 <w:szCs w:val="20"/>
               </w:rPr>
-              <w:t xml:space="preserve">Si el sitio sube posiciones en busquedas como "GPS vehicular Lima". Refleja el retorno de la inversion en visibilidad digital.</w:t>
+              <w:t xml:space="preserve">Si el sitio sube posiciones en búsquedas como "GPS vehicular Lima". Refleja el retorno de la inversión en visibilidad digital a lo largo del tiempo.</w:t>
             </w:r>
           </w:p>
         </w:tc>
@@ -4839,7 +4839,7 @@
                 <w:sz w:val="20"/>
                 <w:szCs w:val="20"/>
               </w:rPr>
-              <w:t xml:space="preserve">Volumen total de personas que ingresan al sitio. Permite detectar tendencias de crecimiento o caidas mes a mes.</w:t>
+              <w:t xml:space="preserve">El volumen total de personas que ingresan. Permite detectar tendencias de crecimiento o caídas mes a mes, y relacionarlas con acciones comerciales específicas.</w:t>
             </w:r>
           </w:p>
         </w:tc>
@@ -4896,7 +4896,7 @@
           <w:sz w:val="22"/>
           <w:szCs w:val="22"/>
         </w:rPr>
-        <w:t xml:space="preserve"> Todos estos indicadores estan activos desde el primer dia de lanzamiento, sin configuracion adicional.</w:t>
+        <w:t xml:space="preserve"> Todos estos indicadores están activos desde el primer día de lanzamiento. No requieren configuración adicional ni herramientas de pago.</w:t>
       </w:r>
     </w:p>
     <w:p>
@@ -4936,7 +4936,7 @@
           <w:sz w:val="30"/>
           <w:szCs w:val="30"/>
         </w:rPr>
-        <w:t xml:space="preserve">6. Conclusion</w:t>
+        <w:t xml:space="preserve">6. Conclusión</w:t>
       </w:r>
     </w:p>
     <w:p>
@@ -4974,7 +4974,7 @@
           <w:sz w:val="22"/>
           <w:szCs w:val="22"/>
         </w:rPr>
-        <w:t xml:space="preserve">El nuevo sitio web de Unidos por GPS no es solo una actualizacion estetica. Es una herramienta comercial: un vendedor digital disponible las 24 horas, que captura clientes potenciales, filtra mensajes falsos, notifica al equipo comercial en tiempo real y posiciona a la empresa en Google — todo de forma automatica.</w:t>
+        <w:t xml:space="preserve">El nuevo sitio web de Unidos por GPS no es una actualización estética. Es una herramienta comercial: un vendedor digital disponible las 24 horas que captura clientes potenciales, filtra mensajes falsos, notifica al equipo comercial en tiempo real y posiciona a la empresa en Google — todo de forma automática.</w:t>
       </w:r>
     </w:p>
     <w:p>
@@ -5012,7 +5012,7 @@
           <w:sz w:val="22"/>
           <w:szCs w:val="22"/>
         </w:rPr>
-        <w:t xml:space="preserve">La arquitectura del sitio fue construida para crecer con el negocio. La Fase 2 completara la vision: el equipo comercial tendra autonomia total para mantener el sitio actualizado sin depender de ningun desarrollador, reduciendo los costos de soporte a largo plazo a practicamente cero.</w:t>
+        <w:t xml:space="preserve">La Fase 2 completará la visión: el equipo comercial tendrá autonomía total para mantener el sitio actualizado sin depender de ningún desarrollador, reduciendo el costo de soporte a largo plazo a prácticamente cero.</w:t>
       </w:r>
     </w:p>
     <w:p>
@@ -5050,7 +5050,7 @@
           <w:sz w:val="22"/>
           <w:szCs w:val="22"/>
         </w:rPr>
-        <w:t xml:space="preserve">Unidos por GPS lleva mas de 13 anos protegiendo vehiculos en el Peru. Este sitio web esta a la altura de esa trayectoria.</w:t>
+        <w:t xml:space="preserve">Unidos por GPS lleva más de 13 años protegiendo vehículos en el Perú. Este sitio web está a la altura de esa trayectoria — y preparado para los próximos 13.</w:t>
       </w:r>
     </w:p>
     <w:p>
@@ -5092,7 +5092,7 @@
           <w:sz w:val="22"/>
           <w:szCs w:val="22"/>
         </w:rPr>
-        <w:t xml:space="preserve">Unidos por GPS — Protegiendo lo que mas importa desde 2013</w:t>
+        <w:t xml:space="preserve">Unidos por GPS — Protegiendo lo que más importa desde 2013</w:t>
       </w:r>
     </w:p>
     <w:p>
@@ -5218,7 +5218,7 @@
         <w:sz w:val="18"/>
         <w:szCs w:val="18"/>
       </w:rPr>
-      <w:t xml:space="preserve">Pagina </w:t>
+      <w:t xml:space="preserve">Página </w:t>
     </w:r>
     <w:r>
       <w:rPr>
@@ -5331,7 +5331,7 @@
         <w:sz w:val="18"/>
         <w:szCs w:val="18"/>
       </w:rPr>
-      <w:t xml:space="preserve">|  Informe de Entrega — Version 1.0  |  Agosto 2026</w:t>
+      <w:t xml:space="preserve">|  Informe de Entrega — Versión 1.0  |  Agosto 2026</w:t>
     </w:r>
   </w:p>
 </w:hdr>

</xml_diff>